<commit_message>
done with RE TN, dictionary v1.10
</commit_message>
<xml_diff>
--- a/summ_table_templ.docx
+++ b/summ_table_templ.docx
@@ -238,6 +238,251 @@
                 <w:sz w:val="22"/>
               </w:rPr>
               <w:t>Пуск РАС</w:t>
+            </w:r>
+          </w:p>
+        </w:tc>
+      </w:tr>
+      <w:tr>
+        <w:tc>
+          <w:tcPr>
+            <w:tcW w:type="dxa" w:w="720"/>
+            <w:gridSpan w:val="9"/>
+          </w:tcPr>
+          <w:p>
+            <w:pPr>
+              <w:jc w:val="center"/>
+            </w:pPr>
+            <w:r>
+              <w:rPr>
+                <w:b/>
+                <w:sz w:val="22"/>
+              </w:rPr>
+              <w:t>{% if fsu.get_fsu_buttons() %}Виртуальные кнопки{% endif %}</w:t>
+            </w:r>
+          </w:p>
+        </w:tc>
+      </w:tr>
+      <w:tr>
+        <w:tc>
+          <w:tcPr>
+            <w:tcW w:type="dxa" w:w="5760"/>
+          </w:tcPr>
+          <w:p/>
+        </w:tc>
+        <w:tc>
+          <w:tcPr>
+            <w:tcW w:type="dxa" w:w="2880"/>
+          </w:tcPr>
+          <w:p>
+            <w:r>
+              <w:rPr>
+                <w:sz w:val="22"/>
+              </w:rPr>
+              <w:t>{% if fsu.get_fsu_buttons() %}{%tr for row in fsu.get_fsu_buttons() %}</w:t>
+            </w:r>
+          </w:p>
+        </w:tc>
+        <w:tc>
+          <w:tcPr>
+            <w:tcW w:type="dxa" w:w="1440"/>
+          </w:tcPr>
+          <w:p/>
+        </w:tc>
+        <w:tc>
+          <w:tcPr>
+            <w:tcW w:type="dxa" w:w="1440"/>
+          </w:tcPr>
+          <w:p/>
+        </w:tc>
+        <w:tc>
+          <w:tcPr>
+            <w:tcW w:type="dxa" w:w="720"/>
+          </w:tcPr>
+          <w:p/>
+        </w:tc>
+        <w:tc>
+          <w:tcPr>
+            <w:tcW w:type="dxa" w:w="720"/>
+          </w:tcPr>
+          <w:p/>
+        </w:tc>
+        <w:tc>
+          <w:tcPr>
+            <w:tcW w:type="dxa" w:w="720"/>
+          </w:tcPr>
+          <w:p/>
+        </w:tc>
+        <w:tc>
+          <w:tcPr>
+            <w:tcW w:type="dxa" w:w="720"/>
+          </w:tcPr>
+          <w:p/>
+        </w:tc>
+        <w:tc>
+          <w:tcPr>
+            <w:tcW w:type="dxa" w:w="720"/>
+          </w:tcPr>
+          <w:p/>
+        </w:tc>
+      </w:tr>
+      <w:tr>
+        <w:tc>
+          <w:tcPr>
+            <w:tcW w:type="dxa" w:w="5760"/>
+          </w:tcPr>
+          <w:p>
+            <w:pPr>
+              <w:jc w:val="center"/>
+            </w:pPr>
+            <w:r>
+              <w:rPr>
+                <w:sz w:val="22"/>
+              </w:rPr>
+              <w:t>{{ row["Полное наименование сигнала"] }}</w:t>
+            </w:r>
+          </w:p>
+        </w:tc>
+        <w:tc>
+          <w:tcPr>
+            <w:tcW w:type="dxa" w:w="2880"/>
+          </w:tcPr>
+          <w:p>
+            <w:pPr>
+              <w:jc w:val="center"/>
+            </w:pPr>
+            <w:r>
+              <w:rPr>
+                <w:sz w:val="22"/>
+              </w:rPr>
+              <w:t>{{ row["Наименование сигналов на ФСУ"] }}</w:t>
+            </w:r>
+          </w:p>
+        </w:tc>
+        <w:tc>
+          <w:tcPr>
+            <w:tcW w:type="dxa" w:w="1440"/>
+          </w:tcPr>
+          <w:p>
+            <w:pPr>
+              <w:jc w:val="center"/>
+            </w:pPr>
+            <w:r>
+              <w:rPr>
+                <w:sz w:val="22"/>
+              </w:rPr>
+              <w:t>{{ row["Дискретные входы"] }}</w:t>
+            </w:r>
+          </w:p>
+        </w:tc>
+        <w:tc>
+          <w:tcPr>
+            <w:tcW w:type="dxa" w:w="1440"/>
+          </w:tcPr>
+          <w:p>
+            <w:pPr>
+              <w:jc w:val="center"/>
+            </w:pPr>
+            <w:r>
+              <w:rPr>
+                <w:sz w:val="22"/>
+              </w:rPr>
+              <w:t>{{ row["Выходные реле"] }}</w:t>
+            </w:r>
+          </w:p>
+        </w:tc>
+        <w:tc>
+          <w:tcPr>
+            <w:tcW w:type="dxa" w:w="720"/>
+          </w:tcPr>
+          <w:p>
+            <w:pPr>
+              <w:jc w:val="center"/>
+            </w:pPr>
+            <w:r>
+              <w:rPr>
+                <w:sz w:val="22"/>
+              </w:rPr>
+              <w:t>{{ row["Светодиоды"] }}</w:t>
+            </w:r>
+          </w:p>
+        </w:tc>
+        <w:tc>
+          <w:tcPr>
+            <w:tcW w:type="dxa" w:w="720"/>
+          </w:tcPr>
+          <w:p>
+            <w:pPr>
+              <w:jc w:val="center"/>
+            </w:pPr>
+            <w:r>
+              <w:rPr>
+                <w:sz w:val="22"/>
+              </w:rPr>
+              <w:t>{{ row["ФК"] }}</w:t>
+            </w:r>
+          </w:p>
+        </w:tc>
+        <w:tc>
+          <w:tcPr>
+            <w:tcW w:type="dxa" w:w="720"/>
+          </w:tcPr>
+          <w:p>
+            <w:pPr>
+              <w:jc w:val="center"/>
+            </w:pPr>
+            <w:r>
+              <w:rPr>
+                <w:sz w:val="22"/>
+              </w:rPr>
+              <w:t>{{ row["РС"] }}</w:t>
+            </w:r>
+          </w:p>
+        </w:tc>
+        <w:tc>
+          <w:tcPr>
+            <w:tcW w:type="dxa" w:w="720"/>
+          </w:tcPr>
+          <w:p>
+            <w:pPr>
+              <w:jc w:val="center"/>
+            </w:pPr>
+            <w:r>
+              <w:rPr>
+                <w:sz w:val="22"/>
+              </w:rPr>
+              <w:t>{{ row["РАС"] }}</w:t>
+            </w:r>
+          </w:p>
+        </w:tc>
+        <w:tc>
+          <w:tcPr>
+            <w:tcW w:type="dxa" w:w="720"/>
+          </w:tcPr>
+          <w:p>
+            <w:pPr>
+              <w:jc w:val="center"/>
+            </w:pPr>
+            <w:r>
+              <w:rPr>
+                <w:sz w:val="22"/>
+              </w:rPr>
+              <w:t>{{ row["Пуск РАС"] }}</w:t>
+            </w:r>
+          </w:p>
+        </w:tc>
+      </w:tr>
+      <w:tr>
+        <w:tc>
+          <w:tcPr>
+            <w:tcW w:type="dxa" w:w="720"/>
+            <w:gridSpan w:val="9"/>
+          </w:tcPr>
+          <w:p>
+            <w:r>
+              <w:rPr>
+                <w:sz w:val="22"/>
+              </w:rPr>
+              <w:t>{%tr endfor %}{% endif %}</w:t>
             </w:r>
           </w:p>
         </w:tc>

</xml_diff>